<commit_message>
Rebrand demo initiative from Project CLARITY to Project Qlarity
Rename the flagship demo initiative to "Project Qlarity" (a Qlik + Clarity
play) across all generators and source content, then regenerate the decks,
documents, and demo scripts so the deliverables match.

- Display name only: "Project CLARITY"/"CLARITY" -> "Project Qlarity"/"Qlarity"
- Kept the PROJ-CLARITY-2025 document ID and Business Case filename intact
- Left code identifiers (clarityContext/projClarity) and the common word
  "clarity" untouched
- Regenerated 3 PPTX decks, the DOCX docs, demo scripts, and the glossary

Co-Authored-By: Claude Opus 4.8 <noreply@anthropic.com>
</commit_message>
<xml_diff>
--- a/documents/compliance/COMP-2025-NVWA_Corrective_Action_Plan.docx
+++ b/documents/compliance/COMP-2025-NVWA_Corrective_Action_Plan.docx
@@ -1253,7 +1253,7 @@
           <w:sz w:val="21"/>
           <w:szCs w:val="21"/>
         </w:rPr>
-        <w:t xml:space="preserve">Project CLARITY Phase 1</w:t>
+        <w:t xml:space="preserve">Project Qlarity Phase 1</w:t>
       </w:r>
     </w:p>
     <w:p>
@@ -1297,7 +1297,7 @@
           <w:sz w:val="21"/>
           <w:szCs w:val="21"/>
         </w:rPr>
-        <w:t xml:space="preserve">This corrective action depends on the implementation of Project CLARITY, which will create a unified data layer connecting all 4 traceability systems. Business case presented to senior leadership on 15 October 2025. CIO review scheduled for 31 October 2025.</w:t>
+        <w:t xml:space="preserve">This corrective action depends on the implementation of Project Qlarity, which will create a unified data layer connecting all 4 traceability systems. Business case presented to senior leadership on 15 October 2025. CIO review scheduled for 31 October 2025.</w:t>
       </w:r>
     </w:p>
     <w:p>

</xml_diff>